<commit_message>
AASPCNJ01: sobrenomes (Raony Chagas/Levi Santos) + guia de evidências
- Aplica sobrenomes nos 18 .md e na planilha; regenera os 18 .docx.
- Índice -> v1.4.
- Cria _interno/COLETA-EVIDENCIAS_AASPCNJ_Tech-Lead (.md + .docx):
  guia por documento/processo do que o Raony deve levantar (prints,
  exports e links de Azure DevOps, ClickUp, RabbitMQ, banco, Elastic,
  Postman) para sustentar as referências técnicas dos registros.

https://claude.ai/code/session_01Lvzca1A5yJyk8RTZH29onh
</commit_message>
<xml_diff>
--- a/mps-nivel-c/oficial/04_registros/AASP_CNJ/ATA-AASPCNJ01-001_Ata-Alinhamento-Fluxo-CNJ.docx
+++ b/mps-nivel-c/oficial/04_registros/AASP_CNJ/ATA-AASPCNJ01-001_Ata-Alinhamento-Fluxo-CNJ.docx
@@ -630,7 +630,7 @@
                 <w:i w:val="0"/>
                 <w:sz w:val="20"/>
               </w:rPr>
-              <w:t>Raony</w:t>
+              <w:t>Raony Chagas</w:t>
             </w:r>
           </w:p>
         </w:tc>
@@ -711,7 +711,7 @@
                 <w:i w:val="0"/>
                 <w:sz w:val="20"/>
               </w:rPr>
-              <w:t>Levi</w:t>
+              <w:t>Levi Santos</w:t>
             </w:r>
           </w:p>
         </w:tc>
@@ -1328,7 +1328,7 @@
                 <w:i w:val="0"/>
                 <w:sz w:val="20"/>
               </w:rPr>
-              <w:t>Raony</w:t>
+              <w:t>Raony Chagas</w:t>
             </w:r>
           </w:p>
         </w:tc>
@@ -1409,7 +1409,7 @@
                 <w:i w:val="0"/>
                 <w:sz w:val="20"/>
               </w:rPr>
-              <w:t>Raony</w:t>
+              <w:t>Raony Chagas</w:t>
             </w:r>
           </w:p>
         </w:tc>
@@ -1628,7 +1628,7 @@
                 <w:i w:val="0"/>
                 <w:sz w:val="20"/>
               </w:rPr>
-              <w:t>Raony</w:t>
+              <w:t>Raony Chagas</w:t>
             </w:r>
           </w:p>
         </w:tc>

</xml_diff>

<commit_message>
docs(registros): AASP_CNJ e AASP_AndamentosProcessuais — registros MPS-SW completos
Pacote de registros (04_registros) dos dois projetos AASP:
- AASP_CNJ (AASPCNJ01) e AASP_AndamentosProcessuais (AASPAP01)
- TAP/PLA/REQ/RASTR/PCP/ITP/VV/REL-VV/GCO/GDE/MED/GQA/CR/ATA/RAC/REV + GEST + INTAKE
- Evidencias embutidas nos docx (DevOps, schemas, swagger, CA, parceiras)
- Remove CAP e 00_INDICE; tags sequenciais; V&V fiel ao intake

Co-Authored-By: Claude Opus 4.8 (1M context) <noreply@anthropic.com>
</commit_message>
<xml_diff>
--- a/mps-nivel-c/oficial/04_registros/AASP_CNJ/ATA-AASPCNJ01-001_Ata-Alinhamento-Fluxo-CNJ.docx
+++ b/mps-nivel-c/oficial/04_registros/AASP_CNJ/ATA-AASPCNJ01-001_Ata-Alinhamento-Fluxo-CNJ.docx
@@ -34,7 +34,7 @@
           <w:color w:val="555555"/>
           <w:sz w:val="20"/>
         </w:rPr>
-        <w:t>Time   ·   Versão Data   ·   Abraão Oliveira / time   ·   Timeware Brasil</w:t>
+        <w:t>Time   ·   Versão Data   ·   Cezar Hiraki Velazquez / time   ·   Timeware Brasil</w:t>
       </w:r>
     </w:p>
     <w:p>
@@ -394,7 +394,7 @@
                 <w:i w:val="0"/>
                 <w:sz w:val="20"/>
               </w:rPr>
-              <w:t>Abraão Oliveira</w:t>
+              <w:t>Cezar Hiraki Velazquez</w:t>
             </w:r>
           </w:p>
         </w:tc>
@@ -548,7 +548,7 @@
                 <w:i w:val="0"/>
                 <w:sz w:val="20"/>
               </w:rPr>
-              <w:t>Abraão Oliveira</w:t>
+              <w:t>Cezar Hiraki Velazquez</w:t>
             </w:r>
           </w:p>
         </w:tc>
@@ -711,7 +711,7 @@
                 <w:i w:val="0"/>
                 <w:sz w:val="20"/>
               </w:rPr>
-              <w:t>Levi Santos</w:t>
+              <w:t>Renan Kiyoshi</w:t>
             </w:r>
           </w:p>
         </w:tc>
@@ -1146,7 +1146,7 @@
                 <w:i w:val="0"/>
                 <w:sz w:val="20"/>
               </w:rPr>
-              <w:t>Abraão Oliveira / time</w:t>
+              <w:t>Cezar Hiraki Velazquez / time</w:t>
             </w:r>
           </w:p>
         </w:tc>
@@ -1227,7 +1227,7 @@
                 <w:i w:val="0"/>
                 <w:sz w:val="20"/>
               </w:rPr>
-              <w:t>Abraão Oliveira / time</w:t>
+              <w:t>Cezar Hiraki Velazquez / time</w:t>
             </w:r>
           </w:p>
         </w:tc>
@@ -1801,7 +1801,7 @@
                 <w:i w:val="0"/>
                 <w:sz w:val="20"/>
               </w:rPr>
-              <w:t>Abraão Oliveira</w:t>
+              <w:t>Cezar Hiraki Velazquez</w:t>
             </w:r>
           </w:p>
         </w:tc>
@@ -2152,7 +2152,7 @@
         <w:color w:val="555555"/>
         <w:sz w:val="16"/>
       </w:rPr>
-      <w:t>vData  ·  Abraão Oliveira / time</w:t>
+      <w:t>vData  ·  Cezar Hiraki Velazquez / time</w:t>
     </w:r>
     <w:r>
       <w:tab/>
@@ -2214,7 +2214,7 @@
         <w:color w:val="555555"/>
         <w:sz w:val="16"/>
       </w:rPr>
-      <w:t>vData  ·  Abraão Oliveira / time</w:t>
+      <w:t>vData  ·  Cezar Hiraki Velazquez / time</w:t>
     </w:r>
     <w:r>
       <w:tab/>

</xml_diff>